<commit_message>
Update POS data management UI flows
</commit_message>
<xml_diff>
--- a/PRD-POS数据管理平台.docx
+++ b/PRD-POS数据管理平台.docx
@@ -4,9 +4,15 @@
   <w:body>
     <w:p>
       <w:pPr>
-        <w:spacing w:before="0" w:after="60" w:line="264" w:lineRule="auto"/>
-      </w:pPr>
-      <w:r>
+        <w:spacing w:before="0" w:after="320" w:line="264" w:lineRule="auto"/>
+      </w:pPr>
+      <w:r>
+        <w:rPr>
+          <w:rFonts w:ascii="Calibri" w:hAnsi="Calibri" w:eastAsia="Microsoft YaHei"/>
+          <w:b/>
+          <w:color w:val="1F4D78"/>
+          <w:sz w:val="44"/>
+        </w:rPr>
         <w:t>PRD-POS数据管理平台</w:t>
       </w:r>
     </w:p>
@@ -1722,6 +1728,2202 @@
         <w:t xml:space="preserve">        └── 系统日志</w:t>
       </w:r>
     </w:p>
+    <w:p>
+      <w:pPr>
+        <w:pStyle w:val="Heading3"/>
+      </w:pPr>
+      <w:r>
+        <w:t>7.1.1 信息架构、布局与交互总览</w:t>
+      </w:r>
+    </w:p>
+    <w:tbl>
+      <w:tblPr>
+        <w:tblStyle w:val="TableGrid"/>
+        <w:tblW w:type="auto" w:w="0"/>
+        <w:tblLayout w:type="fixed"/>
+        <w:tblLook w:firstColumn="1" w:firstRow="1" w:lastColumn="0" w:lastRow="0" w:noHBand="0" w:noVBand="1" w:val="04A0"/>
+        <w:jc w:val="left"/>
+        <w:tblBorders>
+          <w:top w:val="single" w:sz="6" w:space="0" w:color="D9E2F3"/>
+          <w:left w:val="single" w:sz="6" w:space="0" w:color="D9E2F3"/>
+          <w:bottom w:val="single" w:sz="6" w:space="0" w:color="D9E2F3"/>
+          <w:right w:val="single" w:sz="6" w:space="0" w:color="D9E2F3"/>
+          <w:insideH w:val="single" w:sz="6" w:space="0" w:color="D9E2F3"/>
+          <w:insideV w:val="single" w:sz="6" w:space="0" w:color="D9E2F3"/>
+        </w:tblBorders>
+      </w:tblPr>
+      <w:tblGrid>
+        <w:gridCol w:w="1872"/>
+        <w:gridCol w:w="1872"/>
+        <w:gridCol w:w="1872"/>
+        <w:gridCol w:w="1872"/>
+        <w:gridCol w:w="1872"/>
+      </w:tblGrid>
+      <w:tr>
+        <w:tc>
+          <w:tcPr>
+            <w:tcW w:type="dxa" w:w="1440"/>
+            <w:shd w:fill="F2F4F7"/>
+            <w:vAlign w:val="center"/>
+            <w:tcMar>
+              <w:top w:w="80" w:type="dxa"/>
+              <w:start w:w="120" w:type="dxa"/>
+              <w:bottom w:w="80" w:type="dxa"/>
+              <w:end w:w="120" w:type="dxa"/>
+            </w:tcMar>
+          </w:tcPr>
+          <w:p>
+            <w:pPr>
+              <w:jc w:val="center"/>
+            </w:pPr>
+            <w:r>
+              <w:rPr>
+                <w:rFonts w:ascii="Calibri" w:hAnsi="Calibri" w:eastAsia="Microsoft YaHei"/>
+                <w:b/>
+                <w:sz w:val="20"/>
+              </w:rPr>
+              <w:t>模块</w:t>
+            </w:r>
+          </w:p>
+        </w:tc>
+        <w:tc>
+          <w:tcPr>
+            <w:tcW w:type="dxa" w:w="1800"/>
+            <w:shd w:fill="F2F4F7"/>
+            <w:vAlign w:val="center"/>
+            <w:tcMar>
+              <w:top w:w="80" w:type="dxa"/>
+              <w:start w:w="120" w:type="dxa"/>
+              <w:bottom w:w="80" w:type="dxa"/>
+              <w:end w:w="120" w:type="dxa"/>
+            </w:tcMar>
+          </w:tcPr>
+          <w:p>
+            <w:pPr>
+              <w:jc w:val="center"/>
+            </w:pPr>
+            <w:r>
+              <w:rPr>
+                <w:rFonts w:ascii="Calibri" w:hAnsi="Calibri" w:eastAsia="Microsoft YaHei"/>
+                <w:b/>
+                <w:sz w:val="20"/>
+              </w:rPr>
+              <w:t>信息架构</w:t>
+            </w:r>
+          </w:p>
+        </w:tc>
+        <w:tc>
+          <w:tcPr>
+            <w:tcW w:type="dxa" w:w="1944"/>
+            <w:shd w:fill="F2F4F7"/>
+            <w:vAlign w:val="center"/>
+            <w:tcMar>
+              <w:top w:w="80" w:type="dxa"/>
+              <w:start w:w="120" w:type="dxa"/>
+              <w:bottom w:w="80" w:type="dxa"/>
+              <w:end w:w="120" w:type="dxa"/>
+            </w:tcMar>
+          </w:tcPr>
+          <w:p>
+            <w:pPr>
+              <w:jc w:val="center"/>
+            </w:pPr>
+            <w:r>
+              <w:rPr>
+                <w:rFonts w:ascii="Calibri" w:hAnsi="Calibri" w:eastAsia="Microsoft YaHei"/>
+                <w:b/>
+                <w:sz w:val="20"/>
+              </w:rPr>
+              <w:t>页面布局</w:t>
+            </w:r>
+          </w:p>
+        </w:tc>
+        <w:tc>
+          <w:tcPr>
+            <w:tcW w:type="dxa" w:w="2088"/>
+            <w:shd w:fill="F2F4F7"/>
+            <w:vAlign w:val="center"/>
+            <w:tcMar>
+              <w:top w:w="80" w:type="dxa"/>
+              <w:start w:w="120" w:type="dxa"/>
+              <w:bottom w:w="80" w:type="dxa"/>
+              <w:end w:w="120" w:type="dxa"/>
+            </w:tcMar>
+          </w:tcPr>
+          <w:p>
+            <w:pPr>
+              <w:jc w:val="center"/>
+            </w:pPr>
+            <w:r>
+              <w:rPr>
+                <w:rFonts w:ascii="Calibri" w:hAnsi="Calibri" w:eastAsia="Microsoft YaHei"/>
+                <w:b/>
+                <w:sz w:val="20"/>
+              </w:rPr>
+              <w:t>核心交互</w:t>
+            </w:r>
+          </w:p>
+        </w:tc>
+        <w:tc>
+          <w:tcPr>
+            <w:tcW w:type="dxa" w:w="2088"/>
+            <w:shd w:fill="F2F4F7"/>
+            <w:vAlign w:val="center"/>
+            <w:tcMar>
+              <w:top w:w="80" w:type="dxa"/>
+              <w:start w:w="120" w:type="dxa"/>
+              <w:bottom w:w="80" w:type="dxa"/>
+              <w:end w:w="120" w:type="dxa"/>
+            </w:tcMar>
+          </w:tcPr>
+          <w:p>
+            <w:pPr>
+              <w:jc w:val="center"/>
+            </w:pPr>
+            <w:r>
+              <w:rPr>
+                <w:rFonts w:ascii="Calibri" w:hAnsi="Calibri" w:eastAsia="Microsoft YaHei"/>
+                <w:b/>
+                <w:sz w:val="20"/>
+              </w:rPr>
+              <w:t>关键说明</w:t>
+            </w:r>
+          </w:p>
+        </w:tc>
+      </w:tr>
+      <w:tr>
+        <w:tc>
+          <w:tcPr>
+            <w:tcW w:type="dxa" w:w="1440"/>
+            <w:vAlign w:val="center"/>
+            <w:tcMar>
+              <w:top w:w="80" w:type="dxa"/>
+              <w:start w:w="120" w:type="dxa"/>
+              <w:bottom w:w="80" w:type="dxa"/>
+              <w:end w:w="120" w:type="dxa"/>
+            </w:tcMar>
+          </w:tcPr>
+          <w:p>
+            <w:pPr>
+              <w:jc w:val="center"/>
+            </w:pPr>
+            <w:r>
+              <w:rPr>
+                <w:rFonts w:ascii="Calibri" w:hAnsi="Calibri" w:eastAsia="Microsoft YaHei"/>
+                <w:sz w:val="20"/>
+              </w:rPr>
+              <w:t>登录页</w:t>
+            </w:r>
+          </w:p>
+        </w:tc>
+        <w:tc>
+          <w:tcPr>
+            <w:tcW w:type="dxa" w:w="1800"/>
+            <w:vAlign w:val="center"/>
+            <w:tcMar>
+              <w:top w:w="80" w:type="dxa"/>
+              <w:start w:w="120" w:type="dxa"/>
+              <w:bottom w:w="80" w:type="dxa"/>
+              <w:end w:w="120" w:type="dxa"/>
+            </w:tcMar>
+          </w:tcPr>
+          <w:p>
+            <w:r>
+              <w:rPr>
+                <w:rFonts w:ascii="Calibri" w:hAnsi="Calibri" w:eastAsia="Microsoft YaHei"/>
+                <w:sz w:val="20"/>
+              </w:rPr>
+              <w:t>用户进入系统前的身份认证入口</w:t>
+            </w:r>
+          </w:p>
+        </w:tc>
+        <w:tc>
+          <w:tcPr>
+            <w:tcW w:type="dxa" w:w="1944"/>
+            <w:vAlign w:val="center"/>
+            <w:tcMar>
+              <w:top w:w="80" w:type="dxa"/>
+              <w:start w:w="120" w:type="dxa"/>
+              <w:bottom w:w="80" w:type="dxa"/>
+              <w:end w:w="120" w:type="dxa"/>
+            </w:tcMar>
+          </w:tcPr>
+          <w:p>
+            <w:r>
+              <w:rPr>
+                <w:rFonts w:ascii="Calibri" w:hAnsi="Calibri" w:eastAsia="Microsoft YaHei"/>
+                <w:sz w:val="20"/>
+              </w:rPr>
+              <w:t>居中登录表单，包含账号、密码、登录按钮</w:t>
+            </w:r>
+          </w:p>
+        </w:tc>
+        <w:tc>
+          <w:tcPr>
+            <w:tcW w:type="dxa" w:w="2088"/>
+            <w:vAlign w:val="center"/>
+            <w:tcMar>
+              <w:top w:w="80" w:type="dxa"/>
+              <w:start w:w="120" w:type="dxa"/>
+              <w:bottom w:w="80" w:type="dxa"/>
+              <w:end w:w="120" w:type="dxa"/>
+            </w:tcMar>
+          </w:tcPr>
+          <w:p>
+            <w:r>
+              <w:rPr>
+                <w:rFonts w:ascii="Calibri" w:hAnsi="Calibri" w:eastAsia="Microsoft YaHei"/>
+                <w:sz w:val="20"/>
+              </w:rPr>
+              <w:t>输入账号密码后登录；登录成功进入首页概览</w:t>
+            </w:r>
+          </w:p>
+        </w:tc>
+        <w:tc>
+          <w:tcPr>
+            <w:tcW w:type="dxa" w:w="2088"/>
+            <w:vAlign w:val="center"/>
+            <w:tcMar>
+              <w:top w:w="80" w:type="dxa"/>
+              <w:start w:w="120" w:type="dxa"/>
+              <w:bottom w:w="80" w:type="dxa"/>
+              <w:end w:w="120" w:type="dxa"/>
+            </w:tcMar>
+          </w:tcPr>
+          <w:p>
+            <w:r>
+              <w:rPr>
+                <w:rFonts w:ascii="Calibri" w:hAnsi="Calibri" w:eastAsia="Microsoft YaHei"/>
+                <w:sz w:val="20"/>
+              </w:rPr>
+              <w:t>后续应对接真实账号体系和角色权限</w:t>
+            </w:r>
+          </w:p>
+        </w:tc>
+      </w:tr>
+      <w:tr>
+        <w:tc>
+          <w:tcPr>
+            <w:tcW w:type="dxa" w:w="1440"/>
+            <w:vAlign w:val="center"/>
+            <w:tcMar>
+              <w:top w:w="80" w:type="dxa"/>
+              <w:start w:w="120" w:type="dxa"/>
+              <w:bottom w:w="80" w:type="dxa"/>
+              <w:end w:w="120" w:type="dxa"/>
+            </w:tcMar>
+          </w:tcPr>
+          <w:p>
+            <w:pPr>
+              <w:jc w:val="center"/>
+            </w:pPr>
+            <w:r>
+              <w:rPr>
+                <w:rFonts w:ascii="Calibri" w:hAnsi="Calibri" w:eastAsia="Microsoft YaHei"/>
+                <w:sz w:val="20"/>
+              </w:rPr>
+              <w:t>首页概览</w:t>
+            </w:r>
+          </w:p>
+        </w:tc>
+        <w:tc>
+          <w:tcPr>
+            <w:tcW w:type="dxa" w:w="1800"/>
+            <w:vAlign w:val="center"/>
+            <w:tcMar>
+              <w:top w:w="80" w:type="dxa"/>
+              <w:start w:w="120" w:type="dxa"/>
+              <w:bottom w:w="80" w:type="dxa"/>
+              <w:end w:w="120" w:type="dxa"/>
+            </w:tcMar>
+          </w:tcPr>
+          <w:p>
+            <w:pPr>
+              <w:jc w:val="center"/>
+            </w:pPr>
+            <w:r>
+              <w:rPr>
+                <w:rFonts w:ascii="Calibri" w:hAnsi="Calibri" w:eastAsia="Microsoft YaHei"/>
+                <w:sz w:val="20"/>
+              </w:rPr>
+              <w:t>平台整体运营看板</w:t>
+            </w:r>
+          </w:p>
+        </w:tc>
+        <w:tc>
+          <w:tcPr>
+            <w:tcW w:type="dxa" w:w="1944"/>
+            <w:vAlign w:val="center"/>
+            <w:tcMar>
+              <w:top w:w="80" w:type="dxa"/>
+              <w:start w:w="120" w:type="dxa"/>
+              <w:bottom w:w="80" w:type="dxa"/>
+              <w:end w:w="120" w:type="dxa"/>
+            </w:tcMar>
+          </w:tcPr>
+          <w:p>
+            <w:r>
+              <w:rPr>
+                <w:rFonts w:ascii="Calibri" w:hAnsi="Calibri" w:eastAsia="Microsoft YaHei"/>
+                <w:sz w:val="20"/>
+              </w:rPr>
+              <w:t>左侧导航 + 顶部栏 + 指标卡片 + 趋势图 + 待处理列表 + Team进度</w:t>
+            </w:r>
+          </w:p>
+        </w:tc>
+        <w:tc>
+          <w:tcPr>
+            <w:tcW w:type="dxa" w:w="2088"/>
+            <w:vAlign w:val="center"/>
+            <w:tcMar>
+              <w:top w:w="80" w:type="dxa"/>
+              <w:start w:w="120" w:type="dxa"/>
+              <w:bottom w:w="80" w:type="dxa"/>
+              <w:end w:w="120" w:type="dxa"/>
+            </w:tcMar>
+          </w:tcPr>
+          <w:p>
+            <w:r>
+              <w:rPr>
+                <w:rFonts w:ascii="Calibri" w:hAnsi="Calibri" w:eastAsia="Microsoft YaHei"/>
+                <w:sz w:val="20"/>
+              </w:rPr>
+              <w:t>查看核心指标、待处理任务、Team进度；支持按全局年月查看数据</w:t>
+            </w:r>
+          </w:p>
+        </w:tc>
+        <w:tc>
+          <w:tcPr>
+            <w:tcW w:type="dxa" w:w="2088"/>
+            <w:vAlign w:val="center"/>
+            <w:tcMar>
+              <w:top w:w="80" w:type="dxa"/>
+              <w:start w:w="120" w:type="dxa"/>
+              <w:bottom w:w="80" w:type="dxa"/>
+              <w:end w:w="120" w:type="dxa"/>
+            </w:tcMar>
+          </w:tcPr>
+          <w:p>
+            <w:r>
+              <w:rPr>
+                <w:rFonts w:ascii="Calibri" w:hAnsi="Calibri" w:eastAsia="Microsoft YaHei"/>
+                <w:sz w:val="20"/>
+              </w:rPr>
+              <w:t>用于快速了解文件收取、处理完成率、异常待办等情况</w:t>
+            </w:r>
+          </w:p>
+        </w:tc>
+      </w:tr>
+      <w:tr>
+        <w:tc>
+          <w:tcPr>
+            <w:tcW w:type="dxa" w:w="1440"/>
+            <w:vAlign w:val="center"/>
+            <w:tcMar>
+              <w:top w:w="80" w:type="dxa"/>
+              <w:start w:w="120" w:type="dxa"/>
+              <w:bottom w:w="80" w:type="dxa"/>
+              <w:end w:w="120" w:type="dxa"/>
+            </w:tcMar>
+          </w:tcPr>
+          <w:p>
+            <w:pPr>
+              <w:jc w:val="center"/>
+            </w:pPr>
+            <w:r>
+              <w:rPr>
+                <w:rFonts w:ascii="Calibri" w:hAnsi="Calibri" w:eastAsia="Microsoft YaHei"/>
+                <w:sz w:val="20"/>
+              </w:rPr>
+              <w:t>文件收取</w:t>
+            </w:r>
+          </w:p>
+        </w:tc>
+        <w:tc>
+          <w:tcPr>
+            <w:tcW w:type="dxa" w:w="1800"/>
+            <w:vAlign w:val="center"/>
+            <w:tcMar>
+              <w:top w:w="80" w:type="dxa"/>
+              <w:start w:w="120" w:type="dxa"/>
+              <w:bottom w:w="80" w:type="dxa"/>
+              <w:end w:w="120" w:type="dxa"/>
+            </w:tcMar>
+          </w:tcPr>
+          <w:p>
+            <w:r>
+              <w:rPr>
+                <w:rFonts w:ascii="Calibri" w:hAnsi="Calibri" w:eastAsia="Microsoft YaHei"/>
+                <w:sz w:val="20"/>
+              </w:rPr>
+              <w:t>POS文件收取与上传管理</w:t>
+            </w:r>
+          </w:p>
+        </w:tc>
+        <w:tc>
+          <w:tcPr>
+            <w:tcW w:type="dxa" w:w="1944"/>
+            <w:vAlign w:val="center"/>
+            <w:tcMar>
+              <w:top w:w="80" w:type="dxa"/>
+              <w:start w:w="120" w:type="dxa"/>
+              <w:bottom w:w="80" w:type="dxa"/>
+              <w:end w:w="120" w:type="dxa"/>
+            </w:tcMar>
+          </w:tcPr>
+          <w:p>
+            <w:r>
+              <w:rPr>
+                <w:rFonts w:ascii="Calibri" w:hAnsi="Calibri" w:eastAsia="Microsoft YaHei"/>
+                <w:sz w:val="20"/>
+              </w:rPr>
+              <w:t>顶部进度概览 + 收件箱、原始门店数据列表、归档、暂存数据页签 + 数据表格</w:t>
+            </w:r>
+          </w:p>
+        </w:tc>
+        <w:tc>
+          <w:tcPr>
+            <w:tcW w:type="dxa" w:w="2088"/>
+            <w:vAlign w:val="center"/>
+            <w:tcMar>
+              <w:top w:w="80" w:type="dxa"/>
+              <w:start w:w="120" w:type="dxa"/>
+              <w:bottom w:w="80" w:type="dxa"/>
+              <w:end w:w="120" w:type="dxa"/>
+            </w:tcMar>
+          </w:tcPr>
+          <w:p>
+            <w:r>
+              <w:rPr>
+                <w:rFonts w:ascii="Calibri" w:hAnsi="Calibri" w:eastAsia="Microsoft YaHei"/>
+                <w:sz w:val="20"/>
+              </w:rPr>
+              <w:t>切换页签、搜索文件、筛选状态、上传文件、查看明细</w:t>
+            </w:r>
+          </w:p>
+        </w:tc>
+        <w:tc>
+          <w:tcPr>
+            <w:tcW w:type="dxa" w:w="2088"/>
+            <w:vAlign w:val="center"/>
+            <w:tcMar>
+              <w:top w:w="80" w:type="dxa"/>
+              <w:start w:w="120" w:type="dxa"/>
+              <w:bottom w:w="80" w:type="dxa"/>
+              <w:end w:w="120" w:type="dxa"/>
+            </w:tcMar>
+          </w:tcPr>
+          <w:p>
+            <w:r>
+              <w:rPr>
+                <w:rFonts w:ascii="Calibri" w:hAnsi="Calibri" w:eastAsia="Microsoft YaHei"/>
+                <w:sz w:val="20"/>
+              </w:rPr>
+              <w:t>承接原始POS文件进入平台的第一步</w:t>
+            </w:r>
+          </w:p>
+        </w:tc>
+      </w:tr>
+      <w:tr>
+        <w:tc>
+          <w:tcPr>
+            <w:tcW w:type="dxa" w:w="1440"/>
+            <w:vAlign w:val="center"/>
+            <w:tcMar>
+              <w:top w:w="80" w:type="dxa"/>
+              <w:start w:w="120" w:type="dxa"/>
+              <w:bottom w:w="80" w:type="dxa"/>
+              <w:end w:w="120" w:type="dxa"/>
+            </w:tcMar>
+          </w:tcPr>
+          <w:p>
+            <w:pPr>
+              <w:jc w:val="center"/>
+            </w:pPr>
+            <w:r>
+              <w:rPr>
+                <w:rFonts w:ascii="Calibri" w:hAnsi="Calibri" w:eastAsia="Microsoft YaHei"/>
+                <w:sz w:val="20"/>
+              </w:rPr>
+              <w:t>质量检查</w:t>
+            </w:r>
+          </w:p>
+        </w:tc>
+        <w:tc>
+          <w:tcPr>
+            <w:tcW w:type="dxa" w:w="1800"/>
+            <w:vAlign w:val="center"/>
+            <w:tcMar>
+              <w:top w:w="80" w:type="dxa"/>
+              <w:start w:w="120" w:type="dxa"/>
+              <w:bottom w:w="80" w:type="dxa"/>
+              <w:end w:w="120" w:type="dxa"/>
+            </w:tcMar>
+          </w:tcPr>
+          <w:p>
+            <w:pPr>
+              <w:jc w:val="center"/>
+            </w:pPr>
+            <w:r>
+              <w:rPr>
+                <w:rFonts w:ascii="Calibri" w:hAnsi="Calibri" w:eastAsia="Microsoft YaHei"/>
+                <w:sz w:val="20"/>
+              </w:rPr>
+              <w:t>原始POS数据质量校验</w:t>
+            </w:r>
+          </w:p>
+        </w:tc>
+        <w:tc>
+          <w:tcPr>
+            <w:tcW w:type="dxa" w:w="1944"/>
+            <w:vAlign w:val="center"/>
+            <w:tcMar>
+              <w:top w:w="80" w:type="dxa"/>
+              <w:start w:w="120" w:type="dxa"/>
+              <w:bottom w:w="80" w:type="dxa"/>
+              <w:end w:w="120" w:type="dxa"/>
+            </w:tcMar>
+          </w:tcPr>
+          <w:p>
+            <w:r>
+              <w:rPr>
+                <w:rFonts w:ascii="Calibri" w:hAnsi="Calibri" w:eastAsia="Microsoft YaHei"/>
+                <w:sz w:val="20"/>
+              </w:rPr>
+              <w:t>顶部区域质检概览 + 标准POS表、异常数据页签 + 筛选区 + 明细表格</w:t>
+            </w:r>
+          </w:p>
+        </w:tc>
+        <w:tc>
+          <w:tcPr>
+            <w:tcW w:type="dxa" w:w="2088"/>
+            <w:vAlign w:val="center"/>
+            <w:tcMar>
+              <w:top w:w="80" w:type="dxa"/>
+              <w:start w:w="120" w:type="dxa"/>
+              <w:bottom w:w="80" w:type="dxa"/>
+              <w:end w:w="120" w:type="dxa"/>
+            </w:tcMar>
+          </w:tcPr>
+          <w:p>
+            <w:r>
+              <w:rPr>
+                <w:rFonts w:ascii="Calibri" w:hAnsi="Calibri" w:eastAsia="Microsoft YaHei"/>
+                <w:sz w:val="20"/>
+              </w:rPr>
+              <w:t>搜索、筛选、查看异常、通过、驳回、编辑异常数据</w:t>
+            </w:r>
+          </w:p>
+        </w:tc>
+        <w:tc>
+          <w:tcPr>
+            <w:tcW w:type="dxa" w:w="2088"/>
+            <w:vAlign w:val="center"/>
+            <w:tcMar>
+              <w:top w:w="80" w:type="dxa"/>
+              <w:start w:w="120" w:type="dxa"/>
+              <w:bottom w:w="80" w:type="dxa"/>
+              <w:end w:w="120" w:type="dxa"/>
+            </w:tcMar>
+          </w:tcPr>
+          <w:p>
+            <w:r>
+              <w:rPr>
+                <w:rFonts w:ascii="Calibri" w:hAnsi="Calibri" w:eastAsia="Microsoft YaHei"/>
+                <w:sz w:val="20"/>
+              </w:rPr>
+              <w:t>字段校验规则来自字段配置；异常操作需要写入系统日志</w:t>
+            </w:r>
+          </w:p>
+        </w:tc>
+      </w:tr>
+      <w:tr>
+        <w:tc>
+          <w:tcPr>
+            <w:tcW w:type="dxa" w:w="1440"/>
+            <w:vAlign w:val="center"/>
+            <w:tcMar>
+              <w:top w:w="80" w:type="dxa"/>
+              <w:start w:w="120" w:type="dxa"/>
+              <w:bottom w:w="80" w:type="dxa"/>
+              <w:end w:w="120" w:type="dxa"/>
+            </w:tcMar>
+          </w:tcPr>
+          <w:p>
+            <w:pPr>
+              <w:jc w:val="center"/>
+            </w:pPr>
+            <w:r>
+              <w:rPr>
+                <w:rFonts w:ascii="Calibri" w:hAnsi="Calibri" w:eastAsia="Microsoft YaHei"/>
+                <w:sz w:val="20"/>
+              </w:rPr>
+              <w:t>台账与汇总</w:t>
+            </w:r>
+          </w:p>
+        </w:tc>
+        <w:tc>
+          <w:tcPr>
+            <w:tcW w:type="dxa" w:w="1800"/>
+            <w:vAlign w:val="center"/>
+            <w:tcMar>
+              <w:top w:w="80" w:type="dxa"/>
+              <w:start w:w="120" w:type="dxa"/>
+              <w:bottom w:w="80" w:type="dxa"/>
+              <w:end w:w="120" w:type="dxa"/>
+            </w:tcMar>
+          </w:tcPr>
+          <w:p>
+            <w:r>
+              <w:rPr>
+                <w:rFonts w:ascii="Calibri" w:hAnsi="Calibri" w:eastAsia="Microsoft YaHei"/>
+                <w:sz w:val="20"/>
+              </w:rPr>
+              <w:t>标准化POS明细数据展示与汇总</w:t>
+            </w:r>
+          </w:p>
+        </w:tc>
+        <w:tc>
+          <w:tcPr>
+            <w:tcW w:type="dxa" w:w="1944"/>
+            <w:vAlign w:val="center"/>
+            <w:tcMar>
+              <w:top w:w="80" w:type="dxa"/>
+              <w:start w:w="120" w:type="dxa"/>
+              <w:bottom w:w="80" w:type="dxa"/>
+              <w:end w:w="120" w:type="dxa"/>
+            </w:tcMar>
+          </w:tcPr>
+          <w:p>
+            <w:r>
+              <w:rPr>
+                <w:rFonts w:ascii="Calibri" w:hAnsi="Calibri" w:eastAsia="Microsoft YaHei"/>
+                <w:sz w:val="20"/>
+              </w:rPr>
+              <w:t>筛选区 + 表头控制 + 分组按钮 + 导出按钮 + 标准化明细表格 + 底部单据数量</w:t>
+            </w:r>
+          </w:p>
+        </w:tc>
+        <w:tc>
+          <w:tcPr>
+            <w:tcW w:type="dxa" w:w="2088"/>
+            <w:vAlign w:val="center"/>
+            <w:tcMar>
+              <w:top w:w="80" w:type="dxa"/>
+              <w:start w:w="120" w:type="dxa"/>
+              <w:bottom w:w="80" w:type="dxa"/>
+              <w:end w:w="120" w:type="dxa"/>
+            </w:tcMar>
+          </w:tcPr>
+          <w:p>
+            <w:r>
+              <w:rPr>
+                <w:rFonts w:ascii="Calibri" w:hAnsi="Calibri" w:eastAsia="Microsoft YaHei"/>
+                <w:sz w:val="20"/>
+              </w:rPr>
+              <w:t>年月筛选、关键字搜索、组织筛选、表头字段显示控制、分组折叠展开、导出当前数据</w:t>
+            </w:r>
+          </w:p>
+        </w:tc>
+        <w:tc>
+          <w:tcPr>
+            <w:tcW w:type="dxa" w:w="2088"/>
+            <w:vAlign w:val="center"/>
+            <w:tcMar>
+              <w:top w:w="80" w:type="dxa"/>
+              <w:start w:w="120" w:type="dxa"/>
+              <w:bottom w:w="80" w:type="dxa"/>
+              <w:end w:w="120" w:type="dxa"/>
+            </w:tcMar>
+          </w:tcPr>
+          <w:p>
+            <w:r>
+              <w:rPr>
+                <w:rFonts w:ascii="Calibri" w:hAnsi="Calibri" w:eastAsia="Microsoft YaHei"/>
+                <w:sz w:val="20"/>
+              </w:rPr>
+              <w:t>表头字段受字段配置影响；区域、营业所为系统组织字段，不受字段配置控制</w:t>
+            </w:r>
+          </w:p>
+        </w:tc>
+      </w:tr>
+      <w:tr>
+        <w:tc>
+          <w:tcPr>
+            <w:tcW w:type="dxa" w:w="1440"/>
+            <w:vAlign w:val="center"/>
+            <w:tcMar>
+              <w:top w:w="80" w:type="dxa"/>
+              <w:start w:w="120" w:type="dxa"/>
+              <w:bottom w:w="80" w:type="dxa"/>
+              <w:end w:w="120" w:type="dxa"/>
+            </w:tcMar>
+          </w:tcPr>
+          <w:p>
+            <w:pPr>
+              <w:jc w:val="center"/>
+            </w:pPr>
+            <w:r>
+              <w:rPr>
+                <w:rFonts w:ascii="Calibri" w:hAnsi="Calibri" w:eastAsia="Microsoft YaHei"/>
+                <w:sz w:val="20"/>
+              </w:rPr>
+              <w:t>数据分析</w:t>
+            </w:r>
+          </w:p>
+        </w:tc>
+        <w:tc>
+          <w:tcPr>
+            <w:tcW w:type="dxa" w:w="1800"/>
+            <w:vAlign w:val="center"/>
+            <w:tcMar>
+              <w:top w:w="80" w:type="dxa"/>
+              <w:start w:w="120" w:type="dxa"/>
+              <w:bottom w:w="80" w:type="dxa"/>
+              <w:end w:w="120" w:type="dxa"/>
+            </w:tcMar>
+          </w:tcPr>
+          <w:p>
+            <w:pPr>
+              <w:jc w:val="center"/>
+            </w:pPr>
+            <w:r>
+              <w:rPr>
+                <w:rFonts w:ascii="Calibri" w:hAnsi="Calibri" w:eastAsia="Microsoft YaHei"/>
+                <w:sz w:val="20"/>
+              </w:rPr>
+              <w:t>数据统计分析入口</w:t>
+            </w:r>
+          </w:p>
+        </w:tc>
+        <w:tc>
+          <w:tcPr>
+            <w:tcW w:type="dxa" w:w="1944"/>
+            <w:vAlign w:val="center"/>
+            <w:tcMar>
+              <w:top w:w="80" w:type="dxa"/>
+              <w:start w:w="120" w:type="dxa"/>
+              <w:bottom w:w="80" w:type="dxa"/>
+              <w:end w:w="120" w:type="dxa"/>
+            </w:tcMar>
+          </w:tcPr>
+          <w:p>
+            <w:pPr>
+              <w:jc w:val="center"/>
+            </w:pPr>
+            <w:r>
+              <w:rPr>
+                <w:rFonts w:ascii="Calibri" w:hAnsi="Calibri" w:eastAsia="Microsoft YaHei"/>
+                <w:sz w:val="20"/>
+              </w:rPr>
+              <w:t>当前为一级导航页面</w:t>
+            </w:r>
+          </w:p>
+        </w:tc>
+        <w:tc>
+          <w:tcPr>
+            <w:tcW w:type="dxa" w:w="2088"/>
+            <w:vAlign w:val="center"/>
+            <w:tcMar>
+              <w:top w:w="80" w:type="dxa"/>
+              <w:start w:w="120" w:type="dxa"/>
+              <w:bottom w:w="80" w:type="dxa"/>
+              <w:end w:w="120" w:type="dxa"/>
+            </w:tcMar>
+          </w:tcPr>
+          <w:p>
+            <w:pPr>
+              <w:jc w:val="center"/>
+            </w:pPr>
+            <w:r>
+              <w:rPr>
+                <w:rFonts w:ascii="Calibri" w:hAnsi="Calibri" w:eastAsia="Microsoft YaHei"/>
+                <w:sz w:val="20"/>
+              </w:rPr>
+              <w:t>打开后展示待设计</w:t>
+            </w:r>
+          </w:p>
+        </w:tc>
+        <w:tc>
+          <w:tcPr>
+            <w:tcW w:type="dxa" w:w="2088"/>
+            <w:vAlign w:val="center"/>
+            <w:tcMar>
+              <w:top w:w="80" w:type="dxa"/>
+              <w:start w:w="120" w:type="dxa"/>
+              <w:bottom w:w="80" w:type="dxa"/>
+              <w:end w:w="120" w:type="dxa"/>
+            </w:tcMar>
+          </w:tcPr>
+          <w:p>
+            <w:r>
+              <w:rPr>
+                <w:rFonts w:ascii="Calibri" w:hAnsi="Calibri" w:eastAsia="Microsoft YaHei"/>
+                <w:sz w:val="20"/>
+              </w:rPr>
+              <w:t>后续可扩展销售趋势、区域对比、异常分析等</w:t>
+            </w:r>
+          </w:p>
+        </w:tc>
+      </w:tr>
+      <w:tr>
+        <w:tc>
+          <w:tcPr>
+            <w:tcW w:type="dxa" w:w="1440"/>
+            <w:vAlign w:val="center"/>
+            <w:tcMar>
+              <w:top w:w="80" w:type="dxa"/>
+              <w:start w:w="120" w:type="dxa"/>
+              <w:bottom w:w="80" w:type="dxa"/>
+              <w:end w:w="120" w:type="dxa"/>
+            </w:tcMar>
+          </w:tcPr>
+          <w:p>
+            <w:pPr>
+              <w:jc w:val="center"/>
+            </w:pPr>
+            <w:r>
+              <w:rPr>
+                <w:rFonts w:ascii="Calibri" w:hAnsi="Calibri" w:eastAsia="Microsoft YaHei"/>
+                <w:sz w:val="20"/>
+              </w:rPr>
+              <w:t>系统设置</w:t>
+            </w:r>
+          </w:p>
+        </w:tc>
+        <w:tc>
+          <w:tcPr>
+            <w:tcW w:type="dxa" w:w="1800"/>
+            <w:vAlign w:val="center"/>
+            <w:tcMar>
+              <w:top w:w="80" w:type="dxa"/>
+              <w:start w:w="120" w:type="dxa"/>
+              <w:bottom w:w="80" w:type="dxa"/>
+              <w:end w:w="120" w:type="dxa"/>
+            </w:tcMar>
+          </w:tcPr>
+          <w:p>
+            <w:pPr>
+              <w:jc w:val="center"/>
+            </w:pPr>
+            <w:r>
+              <w:rPr>
+                <w:rFonts w:ascii="Calibri" w:hAnsi="Calibri" w:eastAsia="Microsoft YaHei"/>
+                <w:sz w:val="20"/>
+              </w:rPr>
+              <w:t>平台后台配置入口</w:t>
+            </w:r>
+          </w:p>
+        </w:tc>
+        <w:tc>
+          <w:tcPr>
+            <w:tcW w:type="dxa" w:w="1944"/>
+            <w:vAlign w:val="center"/>
+            <w:tcMar>
+              <w:top w:w="80" w:type="dxa"/>
+              <w:start w:w="120" w:type="dxa"/>
+              <w:bottom w:w="80" w:type="dxa"/>
+              <w:end w:w="120" w:type="dxa"/>
+            </w:tcMar>
+          </w:tcPr>
+          <w:p>
+            <w:r>
+              <w:rPr>
+                <w:rFonts w:ascii="Calibri" w:hAnsi="Calibri" w:eastAsia="Microsoft YaHei"/>
+                <w:sz w:val="20"/>
+              </w:rPr>
+              <w:t>左侧二级菜单：用户管理、角色管理、字段配置、系统日志</w:t>
+            </w:r>
+          </w:p>
+        </w:tc>
+        <w:tc>
+          <w:tcPr>
+            <w:tcW w:type="dxa" w:w="2088"/>
+            <w:vAlign w:val="center"/>
+            <w:tcMar>
+              <w:top w:w="80" w:type="dxa"/>
+              <w:start w:w="120" w:type="dxa"/>
+              <w:bottom w:w="80" w:type="dxa"/>
+              <w:end w:w="120" w:type="dxa"/>
+            </w:tcMar>
+          </w:tcPr>
+          <w:p>
+            <w:r>
+              <w:rPr>
+                <w:rFonts w:ascii="Calibri" w:hAnsi="Calibri" w:eastAsia="Microsoft YaHei"/>
+                <w:sz w:val="20"/>
+              </w:rPr>
+              <w:t>点击二级菜单切换对应配置页面</w:t>
+            </w:r>
+          </w:p>
+        </w:tc>
+        <w:tc>
+          <w:tcPr>
+            <w:tcW w:type="dxa" w:w="2088"/>
+            <w:vAlign w:val="center"/>
+            <w:tcMar>
+              <w:top w:w="80" w:type="dxa"/>
+              <w:start w:w="120" w:type="dxa"/>
+              <w:bottom w:w="80" w:type="dxa"/>
+              <w:end w:w="120" w:type="dxa"/>
+            </w:tcMar>
+          </w:tcPr>
+          <w:p>
+            <w:r>
+              <w:rPr>
+                <w:rFonts w:ascii="Calibri" w:hAnsi="Calibri" w:eastAsia="Microsoft YaHei"/>
+                <w:sz w:val="20"/>
+              </w:rPr>
+              <w:t>系统设置页面不展示顶部全局年月组件</w:t>
+            </w:r>
+          </w:p>
+        </w:tc>
+      </w:tr>
+      <w:tr>
+        <w:tc>
+          <w:tcPr>
+            <w:tcW w:type="dxa" w:w="1440"/>
+            <w:vAlign w:val="center"/>
+            <w:tcMar>
+              <w:top w:w="80" w:type="dxa"/>
+              <w:start w:w="120" w:type="dxa"/>
+              <w:bottom w:w="80" w:type="dxa"/>
+              <w:end w:w="120" w:type="dxa"/>
+            </w:tcMar>
+          </w:tcPr>
+          <w:p>
+            <w:pPr>
+              <w:jc w:val="center"/>
+            </w:pPr>
+            <w:r>
+              <w:rPr>
+                <w:rFonts w:ascii="Calibri" w:hAnsi="Calibri" w:eastAsia="Microsoft YaHei"/>
+                <w:sz w:val="20"/>
+              </w:rPr>
+              <w:t>用户管理</w:t>
+            </w:r>
+          </w:p>
+        </w:tc>
+        <w:tc>
+          <w:tcPr>
+            <w:tcW w:type="dxa" w:w="1800"/>
+            <w:vAlign w:val="center"/>
+            <w:tcMar>
+              <w:top w:w="80" w:type="dxa"/>
+              <w:start w:w="120" w:type="dxa"/>
+              <w:bottom w:w="80" w:type="dxa"/>
+              <w:end w:w="120" w:type="dxa"/>
+            </w:tcMar>
+          </w:tcPr>
+          <w:p>
+            <w:pPr>
+              <w:jc w:val="center"/>
+            </w:pPr>
+            <w:r>
+              <w:rPr>
+                <w:rFonts w:ascii="Calibri" w:hAnsi="Calibri" w:eastAsia="Microsoft YaHei"/>
+                <w:sz w:val="20"/>
+              </w:rPr>
+              <w:t>用户账号、角色分配管理</w:t>
+            </w:r>
+          </w:p>
+        </w:tc>
+        <w:tc>
+          <w:tcPr>
+            <w:tcW w:type="dxa" w:w="1944"/>
+            <w:vAlign w:val="center"/>
+            <w:tcMar>
+              <w:top w:w="80" w:type="dxa"/>
+              <w:start w:w="120" w:type="dxa"/>
+              <w:bottom w:w="80" w:type="dxa"/>
+              <w:end w:w="120" w:type="dxa"/>
+            </w:tcMar>
+          </w:tcPr>
+          <w:p>
+            <w:r>
+              <w:rPr>
+                <w:rFonts w:ascii="Calibri" w:hAnsi="Calibri" w:eastAsia="Microsoft YaHei"/>
+                <w:sz w:val="20"/>
+              </w:rPr>
+              <w:t>筛选区 + 表格工具区 + 用户列表</w:t>
+            </w:r>
+          </w:p>
+        </w:tc>
+        <w:tc>
+          <w:tcPr>
+            <w:tcW w:type="dxa" w:w="2088"/>
+            <w:vAlign w:val="center"/>
+            <w:tcMar>
+              <w:top w:w="80" w:type="dxa"/>
+              <w:start w:w="120" w:type="dxa"/>
+              <w:bottom w:w="80" w:type="dxa"/>
+              <w:end w:w="120" w:type="dxa"/>
+            </w:tcMar>
+          </w:tcPr>
+          <w:p>
+            <w:r>
+              <w:rPr>
+                <w:rFonts w:ascii="Calibri" w:hAnsi="Calibri" w:eastAsia="Microsoft YaHei"/>
+                <w:sz w:val="20"/>
+              </w:rPr>
+              <w:t>搜索用户、筛选状态和角色、新建用户、编辑、停用、重置密码、删除</w:t>
+            </w:r>
+          </w:p>
+        </w:tc>
+        <w:tc>
+          <w:tcPr>
+            <w:tcW w:type="dxa" w:w="2088"/>
+            <w:vAlign w:val="center"/>
+            <w:tcMar>
+              <w:top w:w="80" w:type="dxa"/>
+              <w:start w:w="120" w:type="dxa"/>
+              <w:bottom w:w="80" w:type="dxa"/>
+              <w:end w:w="120" w:type="dxa"/>
+            </w:tcMar>
+          </w:tcPr>
+          <w:p>
+            <w:r>
+              <w:rPr>
+                <w:rFonts w:ascii="Calibri" w:hAnsi="Calibri" w:eastAsia="Microsoft YaHei"/>
+                <w:sz w:val="20"/>
+              </w:rPr>
+              <w:t>用户不直接配置数据权限，继承所分配角色的功能权限和数据权限</w:t>
+            </w:r>
+          </w:p>
+        </w:tc>
+      </w:tr>
+      <w:tr>
+        <w:tc>
+          <w:tcPr>
+            <w:tcW w:type="dxa" w:w="1440"/>
+            <w:vAlign w:val="center"/>
+            <w:tcMar>
+              <w:top w:w="80" w:type="dxa"/>
+              <w:start w:w="120" w:type="dxa"/>
+              <w:bottom w:w="80" w:type="dxa"/>
+              <w:end w:w="120" w:type="dxa"/>
+            </w:tcMar>
+          </w:tcPr>
+          <w:p>
+            <w:pPr>
+              <w:jc w:val="center"/>
+            </w:pPr>
+            <w:r>
+              <w:rPr>
+                <w:rFonts w:ascii="Calibri" w:hAnsi="Calibri" w:eastAsia="Microsoft YaHei"/>
+                <w:sz w:val="20"/>
+              </w:rPr>
+              <w:t>角色管理</w:t>
+            </w:r>
+          </w:p>
+        </w:tc>
+        <w:tc>
+          <w:tcPr>
+            <w:tcW w:type="dxa" w:w="1800"/>
+            <w:vAlign w:val="center"/>
+            <w:tcMar>
+              <w:top w:w="80" w:type="dxa"/>
+              <w:start w:w="120" w:type="dxa"/>
+              <w:bottom w:w="80" w:type="dxa"/>
+              <w:end w:w="120" w:type="dxa"/>
+            </w:tcMar>
+          </w:tcPr>
+          <w:p>
+            <w:r>
+              <w:rPr>
+                <w:rFonts w:ascii="Calibri" w:hAnsi="Calibri" w:eastAsia="Microsoft YaHei"/>
+                <w:sz w:val="20"/>
+              </w:rPr>
+              <w:t>角色、功能权限、数据权限配置</w:t>
+            </w:r>
+          </w:p>
+        </w:tc>
+        <w:tc>
+          <w:tcPr>
+            <w:tcW w:type="dxa" w:w="1944"/>
+            <w:vAlign w:val="center"/>
+            <w:tcMar>
+              <w:top w:w="80" w:type="dxa"/>
+              <w:start w:w="120" w:type="dxa"/>
+              <w:bottom w:w="80" w:type="dxa"/>
+              <w:end w:w="120" w:type="dxa"/>
+            </w:tcMar>
+          </w:tcPr>
+          <w:p>
+            <w:r>
+              <w:rPr>
+                <w:rFonts w:ascii="Calibri" w:hAnsi="Calibri" w:eastAsia="Microsoft YaHei"/>
+                <w:sz w:val="20"/>
+              </w:rPr>
+              <w:t>筛选区 + 表格工具区 + 角色列表 + 新建或编辑角色弹窗</w:t>
+            </w:r>
+          </w:p>
+        </w:tc>
+        <w:tc>
+          <w:tcPr>
+            <w:tcW w:type="dxa" w:w="2088"/>
+            <w:vAlign w:val="center"/>
+            <w:tcMar>
+              <w:top w:w="80" w:type="dxa"/>
+              <w:start w:w="120" w:type="dxa"/>
+              <w:bottom w:w="80" w:type="dxa"/>
+              <w:end w:w="120" w:type="dxa"/>
+            </w:tcMar>
+          </w:tcPr>
+          <w:p>
+            <w:r>
+              <w:rPr>
+                <w:rFonts w:ascii="Calibri" w:hAnsi="Calibri" w:eastAsia="Microsoft YaHei"/>
+                <w:sz w:val="20"/>
+              </w:rPr>
+              <w:t>新建角色、编辑角色、删除角色；配置功能权限和数据权限策略</w:t>
+            </w:r>
+          </w:p>
+        </w:tc>
+        <w:tc>
+          <w:tcPr>
+            <w:tcW w:type="dxa" w:w="2088"/>
+            <w:vAlign w:val="center"/>
+            <w:tcMar>
+              <w:top w:w="80" w:type="dxa"/>
+              <w:start w:w="120" w:type="dxa"/>
+              <w:bottom w:w="80" w:type="dxa"/>
+              <w:end w:w="120" w:type="dxa"/>
+            </w:tcMar>
+          </w:tcPr>
+          <w:p>
+            <w:r>
+              <w:rPr>
+                <w:rFonts w:ascii="Calibri" w:hAnsi="Calibri" w:eastAsia="Microsoft YaHei"/>
+                <w:sz w:val="20"/>
+              </w:rPr>
+              <w:t>数据权限策略支持全部数据、按区域、按营业所、按经销商、仅本人相关数据</w:t>
+            </w:r>
+          </w:p>
+        </w:tc>
+      </w:tr>
+      <w:tr>
+        <w:tc>
+          <w:tcPr>
+            <w:tcW w:type="dxa" w:w="1440"/>
+            <w:vAlign w:val="center"/>
+            <w:tcMar>
+              <w:top w:w="80" w:type="dxa"/>
+              <w:start w:w="120" w:type="dxa"/>
+              <w:bottom w:w="80" w:type="dxa"/>
+              <w:end w:w="120" w:type="dxa"/>
+            </w:tcMar>
+          </w:tcPr>
+          <w:p>
+            <w:pPr>
+              <w:jc w:val="center"/>
+            </w:pPr>
+            <w:r>
+              <w:rPr>
+                <w:rFonts w:ascii="Calibri" w:hAnsi="Calibri" w:eastAsia="Microsoft YaHei"/>
+                <w:sz w:val="20"/>
+              </w:rPr>
+              <w:t>角色弹窗</w:t>
+            </w:r>
+          </w:p>
+        </w:tc>
+        <w:tc>
+          <w:tcPr>
+            <w:tcW w:type="dxa" w:w="1800"/>
+            <w:vAlign w:val="center"/>
+            <w:tcMar>
+              <w:top w:w="80" w:type="dxa"/>
+              <w:start w:w="120" w:type="dxa"/>
+              <w:bottom w:w="80" w:type="dxa"/>
+              <w:end w:w="120" w:type="dxa"/>
+            </w:tcMar>
+          </w:tcPr>
+          <w:p>
+            <w:pPr>
+              <w:jc w:val="center"/>
+            </w:pPr>
+            <w:r>
+              <w:rPr>
+                <w:rFonts w:ascii="Calibri" w:hAnsi="Calibri" w:eastAsia="Microsoft YaHei"/>
+                <w:sz w:val="20"/>
+              </w:rPr>
+              <w:t>角色配置表单</w:t>
+            </w:r>
+          </w:p>
+        </w:tc>
+        <w:tc>
+          <w:tcPr>
+            <w:tcW w:type="dxa" w:w="1944"/>
+            <w:vAlign w:val="center"/>
+            <w:tcMar>
+              <w:top w:w="80" w:type="dxa"/>
+              <w:start w:w="120" w:type="dxa"/>
+              <w:bottom w:w="80" w:type="dxa"/>
+              <w:end w:w="120" w:type="dxa"/>
+            </w:tcMar>
+          </w:tcPr>
+          <w:p>
+            <w:r>
+              <w:rPr>
+                <w:rFonts w:ascii="Calibri" w:hAnsi="Calibri" w:eastAsia="Microsoft YaHei"/>
+                <w:sz w:val="20"/>
+              </w:rPr>
+              <w:t>单列布局：角色名称、数据权限策略、数据权限范围、功能权限表格</w:t>
+            </w:r>
+          </w:p>
+        </w:tc>
+        <w:tc>
+          <w:tcPr>
+            <w:tcW w:type="dxa" w:w="2088"/>
+            <w:vAlign w:val="center"/>
+            <w:tcMar>
+              <w:top w:w="80" w:type="dxa"/>
+              <w:start w:w="120" w:type="dxa"/>
+              <w:bottom w:w="80" w:type="dxa"/>
+              <w:end w:w="120" w:type="dxa"/>
+            </w:tcMar>
+          </w:tcPr>
+          <w:p>
+            <w:r>
+              <w:rPr>
+                <w:rFonts w:ascii="Calibri" w:hAnsi="Calibri" w:eastAsia="Microsoft YaHei"/>
+                <w:sz w:val="20"/>
+              </w:rPr>
+              <w:t>数据权限策略下拉选择；问号hover展示权限规则；勾选功能权限</w:t>
+            </w:r>
+          </w:p>
+        </w:tc>
+        <w:tc>
+          <w:tcPr>
+            <w:tcW w:type="dxa" w:w="2088"/>
+            <w:vAlign w:val="center"/>
+            <w:tcMar>
+              <w:top w:w="80" w:type="dxa"/>
+              <w:start w:w="120" w:type="dxa"/>
+              <w:bottom w:w="80" w:type="dxa"/>
+              <w:end w:w="120" w:type="dxa"/>
+            </w:tcMar>
+          </w:tcPr>
+          <w:p>
+            <w:r>
+              <w:rPr>
+                <w:rFonts w:ascii="Calibri" w:hAnsi="Calibri" w:eastAsia="Microsoft YaHei"/>
+                <w:sz w:val="20"/>
+              </w:rPr>
+              <w:t>保持表单阅读顺序清晰，避免左右字段分散</w:t>
+            </w:r>
+          </w:p>
+        </w:tc>
+      </w:tr>
+      <w:tr>
+        <w:tc>
+          <w:tcPr>
+            <w:tcW w:type="dxa" w:w="1440"/>
+            <w:vAlign w:val="center"/>
+            <w:tcMar>
+              <w:top w:w="80" w:type="dxa"/>
+              <w:start w:w="120" w:type="dxa"/>
+              <w:bottom w:w="80" w:type="dxa"/>
+              <w:end w:w="120" w:type="dxa"/>
+            </w:tcMar>
+          </w:tcPr>
+          <w:p>
+            <w:pPr>
+              <w:jc w:val="center"/>
+            </w:pPr>
+            <w:r>
+              <w:rPr>
+                <w:rFonts w:ascii="Calibri" w:hAnsi="Calibri" w:eastAsia="Microsoft YaHei"/>
+                <w:sz w:val="20"/>
+              </w:rPr>
+              <w:t>字段配置</w:t>
+            </w:r>
+          </w:p>
+        </w:tc>
+        <w:tc>
+          <w:tcPr>
+            <w:tcW w:type="dxa" w:w="1800"/>
+            <w:vAlign w:val="center"/>
+            <w:tcMar>
+              <w:top w:w="80" w:type="dxa"/>
+              <w:start w:w="120" w:type="dxa"/>
+              <w:bottom w:w="80" w:type="dxa"/>
+              <w:end w:w="120" w:type="dxa"/>
+            </w:tcMar>
+          </w:tcPr>
+          <w:p>
+            <w:r>
+              <w:rPr>
+                <w:rFonts w:ascii="Calibri" w:hAnsi="Calibri" w:eastAsia="Microsoft YaHei"/>
+                <w:sz w:val="20"/>
+              </w:rPr>
+              <w:t>标准字段维护与质检、台账联动</w:t>
+            </w:r>
+          </w:p>
+        </w:tc>
+        <w:tc>
+          <w:tcPr>
+            <w:tcW w:type="dxa" w:w="1944"/>
+            <w:vAlign w:val="center"/>
+            <w:tcMar>
+              <w:top w:w="80" w:type="dxa"/>
+              <w:start w:w="120" w:type="dxa"/>
+              <w:bottom w:w="80" w:type="dxa"/>
+              <w:end w:w="120" w:type="dxa"/>
+            </w:tcMar>
+          </w:tcPr>
+          <w:p>
+            <w:r>
+              <w:rPr>
+                <w:rFonts w:ascii="Calibri" w:hAnsi="Calibri" w:eastAsia="Microsoft YaHei"/>
+                <w:sz w:val="20"/>
+              </w:rPr>
+              <w:t>说明区 + 字段列表 + 新增字段、保存配置按钮</w:t>
+            </w:r>
+          </w:p>
+        </w:tc>
+        <w:tc>
+          <w:tcPr>
+            <w:tcW w:type="dxa" w:w="2088"/>
+            <w:vAlign w:val="center"/>
+            <w:tcMar>
+              <w:top w:w="80" w:type="dxa"/>
+              <w:start w:w="120" w:type="dxa"/>
+              <w:bottom w:w="80" w:type="dxa"/>
+              <w:end w:w="120" w:type="dxa"/>
+            </w:tcMar>
+          </w:tcPr>
+          <w:p>
+            <w:r>
+              <w:rPr>
+                <w:rFonts w:ascii="Calibri" w:hAnsi="Calibri" w:eastAsia="Microsoft YaHei"/>
+                <w:sz w:val="20"/>
+              </w:rPr>
+              <w:t>新增字段、编辑字段、停用字段、调整排序、配置是否参与质量检查、是否显示在台账</w:t>
+            </w:r>
+          </w:p>
+        </w:tc>
+        <w:tc>
+          <w:tcPr>
+            <w:tcW w:type="dxa" w:w="2088"/>
+            <w:vAlign w:val="center"/>
+            <w:tcMar>
+              <w:top w:w="80" w:type="dxa"/>
+              <w:start w:w="120" w:type="dxa"/>
+              <w:bottom w:w="80" w:type="dxa"/>
+              <w:end w:w="120" w:type="dxa"/>
+            </w:tcMar>
+          </w:tcPr>
+          <w:p>
+            <w:r>
+              <w:rPr>
+                <w:rFonts w:ascii="Calibri" w:hAnsi="Calibri" w:eastAsia="Microsoft YaHei"/>
+                <w:sz w:val="20"/>
+              </w:rPr>
+              <w:t>影响质量检查的标准字段校验，以及台账与汇总的表头展示</w:t>
+            </w:r>
+          </w:p>
+        </w:tc>
+      </w:tr>
+      <w:tr>
+        <w:tc>
+          <w:tcPr>
+            <w:tcW w:type="dxa" w:w="1440"/>
+            <w:vAlign w:val="center"/>
+            <w:tcMar>
+              <w:top w:w="80" w:type="dxa"/>
+              <w:start w:w="120" w:type="dxa"/>
+              <w:bottom w:w="80" w:type="dxa"/>
+              <w:end w:w="120" w:type="dxa"/>
+            </w:tcMar>
+          </w:tcPr>
+          <w:p>
+            <w:pPr>
+              <w:jc w:val="center"/>
+            </w:pPr>
+            <w:r>
+              <w:rPr>
+                <w:rFonts w:ascii="Calibri" w:hAnsi="Calibri" w:eastAsia="Microsoft YaHei"/>
+                <w:sz w:val="20"/>
+              </w:rPr>
+              <w:t>系统日志</w:t>
+            </w:r>
+          </w:p>
+        </w:tc>
+        <w:tc>
+          <w:tcPr>
+            <w:tcW w:type="dxa" w:w="1800"/>
+            <w:vAlign w:val="center"/>
+            <w:tcMar>
+              <w:top w:w="80" w:type="dxa"/>
+              <w:start w:w="120" w:type="dxa"/>
+              <w:bottom w:w="80" w:type="dxa"/>
+              <w:end w:w="120" w:type="dxa"/>
+            </w:tcMar>
+          </w:tcPr>
+          <w:p>
+            <w:pPr>
+              <w:jc w:val="center"/>
+            </w:pPr>
+            <w:r>
+              <w:rPr>
+                <w:rFonts w:ascii="Calibri" w:hAnsi="Calibri" w:eastAsia="Microsoft YaHei"/>
+                <w:sz w:val="20"/>
+              </w:rPr>
+              <w:t>用户行为与操作留痕</w:t>
+            </w:r>
+          </w:p>
+        </w:tc>
+        <w:tc>
+          <w:tcPr>
+            <w:tcW w:type="dxa" w:w="1944"/>
+            <w:vAlign w:val="center"/>
+            <w:tcMar>
+              <w:top w:w="80" w:type="dxa"/>
+              <w:start w:w="120" w:type="dxa"/>
+              <w:bottom w:w="80" w:type="dxa"/>
+              <w:end w:w="120" w:type="dxa"/>
+            </w:tcMar>
+          </w:tcPr>
+          <w:p>
+            <w:r>
+              <w:rPr>
+                <w:rFonts w:ascii="Calibri" w:hAnsi="Calibri" w:eastAsia="Microsoft YaHei"/>
+                <w:sz w:val="20"/>
+              </w:rPr>
+              <w:t>筛选区 + 日志列表 + 日志详情</w:t>
+            </w:r>
+          </w:p>
+        </w:tc>
+        <w:tc>
+          <w:tcPr>
+            <w:tcW w:type="dxa" w:w="2088"/>
+            <w:vAlign w:val="center"/>
+            <w:tcMar>
+              <w:top w:w="80" w:type="dxa"/>
+              <w:start w:w="120" w:type="dxa"/>
+              <w:bottom w:w="80" w:type="dxa"/>
+              <w:end w:w="120" w:type="dxa"/>
+            </w:tcMar>
+          </w:tcPr>
+          <w:p>
+            <w:r>
+              <w:rPr>
+                <w:rFonts w:ascii="Calibri" w:hAnsi="Calibri" w:eastAsia="Microsoft YaHei"/>
+                <w:sz w:val="20"/>
+              </w:rPr>
+              <w:t>按用户、模块、操作类型、时间筛选；查看操作详情</w:t>
+            </w:r>
+          </w:p>
+        </w:tc>
+        <w:tc>
+          <w:tcPr>
+            <w:tcW w:type="dxa" w:w="2088"/>
+            <w:vAlign w:val="center"/>
+            <w:tcMar>
+              <w:top w:w="80" w:type="dxa"/>
+              <w:start w:w="120" w:type="dxa"/>
+              <w:bottom w:w="80" w:type="dxa"/>
+              <w:end w:w="120" w:type="dxa"/>
+            </w:tcMar>
+          </w:tcPr>
+          <w:p>
+            <w:r>
+              <w:rPr>
+                <w:rFonts w:ascii="Calibri" w:hAnsi="Calibri" w:eastAsia="Microsoft YaHei"/>
+                <w:sz w:val="20"/>
+              </w:rPr>
+              <w:t>记录登录、退出、查看、编辑、修改、通过、驳回、删除、导出等行为</w:t>
+            </w:r>
+          </w:p>
+        </w:tc>
+      </w:tr>
+      <w:tr>
+        <w:tc>
+          <w:tcPr>
+            <w:tcW w:type="dxa" w:w="1440"/>
+            <w:vAlign w:val="center"/>
+            <w:tcMar>
+              <w:top w:w="80" w:type="dxa"/>
+              <w:start w:w="120" w:type="dxa"/>
+              <w:bottom w:w="80" w:type="dxa"/>
+              <w:end w:w="120" w:type="dxa"/>
+            </w:tcMar>
+          </w:tcPr>
+          <w:p>
+            <w:pPr>
+              <w:jc w:val="center"/>
+            </w:pPr>
+            <w:r>
+              <w:rPr>
+                <w:rFonts w:ascii="Calibri" w:hAnsi="Calibri" w:eastAsia="Microsoft YaHei"/>
+                <w:sz w:val="20"/>
+              </w:rPr>
+              <w:t>全局顶部栏</w:t>
+            </w:r>
+          </w:p>
+        </w:tc>
+        <w:tc>
+          <w:tcPr>
+            <w:tcW w:type="dxa" w:w="1800"/>
+            <w:vAlign w:val="center"/>
+            <w:tcMar>
+              <w:top w:w="80" w:type="dxa"/>
+              <w:start w:w="120" w:type="dxa"/>
+              <w:bottom w:w="80" w:type="dxa"/>
+              <w:end w:w="120" w:type="dxa"/>
+            </w:tcMar>
+          </w:tcPr>
+          <w:p>
+            <w:pPr>
+              <w:jc w:val="center"/>
+            </w:pPr>
+            <w:r>
+              <w:rPr>
+                <w:rFonts w:ascii="Calibri" w:hAnsi="Calibri" w:eastAsia="Microsoft YaHei"/>
+                <w:sz w:val="20"/>
+              </w:rPr>
+              <w:t>当前用户和通用操作区</w:t>
+            </w:r>
+          </w:p>
+        </w:tc>
+        <w:tc>
+          <w:tcPr>
+            <w:tcW w:type="dxa" w:w="1944"/>
+            <w:vAlign w:val="center"/>
+            <w:tcMar>
+              <w:top w:w="80" w:type="dxa"/>
+              <w:start w:w="120" w:type="dxa"/>
+              <w:bottom w:w="80" w:type="dxa"/>
+              <w:end w:w="120" w:type="dxa"/>
+            </w:tcMar>
+          </w:tcPr>
+          <w:p>
+            <w:r>
+              <w:rPr>
+                <w:rFonts w:ascii="Calibri" w:hAnsi="Calibri" w:eastAsia="Microsoft YaHei"/>
+                <w:sz w:val="20"/>
+              </w:rPr>
+              <w:t>页面标题 + 语言切换 + 用户菜单</w:t>
+            </w:r>
+          </w:p>
+        </w:tc>
+        <w:tc>
+          <w:tcPr>
+            <w:tcW w:type="dxa" w:w="2088"/>
+            <w:vAlign w:val="center"/>
+            <w:tcMar>
+              <w:top w:w="80" w:type="dxa"/>
+              <w:start w:w="120" w:type="dxa"/>
+              <w:bottom w:w="80" w:type="dxa"/>
+              <w:end w:w="120" w:type="dxa"/>
+            </w:tcMar>
+          </w:tcPr>
+          <w:p>
+            <w:r>
+              <w:rPr>
+                <w:rFonts w:ascii="Calibri" w:hAnsi="Calibri" w:eastAsia="Microsoft YaHei"/>
+                <w:sz w:val="20"/>
+              </w:rPr>
+              <w:t>点击用户菜单可修改密码、退出登录</w:t>
+            </w:r>
+          </w:p>
+        </w:tc>
+        <w:tc>
+          <w:tcPr>
+            <w:tcW w:type="dxa" w:w="2088"/>
+            <w:vAlign w:val="center"/>
+            <w:tcMar>
+              <w:top w:w="80" w:type="dxa"/>
+              <w:start w:w="120" w:type="dxa"/>
+              <w:bottom w:w="80" w:type="dxa"/>
+              <w:end w:w="120" w:type="dxa"/>
+            </w:tcMar>
+          </w:tcPr>
+          <w:p>
+            <w:r>
+              <w:rPr>
+                <w:rFonts w:ascii="Calibri" w:hAnsi="Calibri" w:eastAsia="Microsoft YaHei"/>
+                <w:sz w:val="20"/>
+              </w:rPr>
+              <w:t>已去掉站内通知；部分页面隐藏全局年月</w:t>
+            </w:r>
+          </w:p>
+        </w:tc>
+      </w:tr>
+      <w:tr>
+        <w:tc>
+          <w:tcPr>
+            <w:tcW w:type="dxa" w:w="1440"/>
+            <w:vAlign w:val="center"/>
+            <w:tcMar>
+              <w:top w:w="80" w:type="dxa"/>
+              <w:start w:w="120" w:type="dxa"/>
+              <w:bottom w:w="80" w:type="dxa"/>
+              <w:end w:w="120" w:type="dxa"/>
+            </w:tcMar>
+          </w:tcPr>
+          <w:p>
+            <w:pPr>
+              <w:jc w:val="center"/>
+            </w:pPr>
+            <w:r>
+              <w:rPr>
+                <w:rFonts w:ascii="Calibri" w:hAnsi="Calibri" w:eastAsia="Microsoft YaHei"/>
+                <w:sz w:val="20"/>
+              </w:rPr>
+              <w:t>左侧导航</w:t>
+            </w:r>
+          </w:p>
+        </w:tc>
+        <w:tc>
+          <w:tcPr>
+            <w:tcW w:type="dxa" w:w="1800"/>
+            <w:vAlign w:val="center"/>
+            <w:tcMar>
+              <w:top w:w="80" w:type="dxa"/>
+              <w:start w:w="120" w:type="dxa"/>
+              <w:bottom w:w="80" w:type="dxa"/>
+              <w:end w:w="120" w:type="dxa"/>
+            </w:tcMar>
+          </w:tcPr>
+          <w:p>
+            <w:pPr>
+              <w:jc w:val="center"/>
+            </w:pPr>
+            <w:r>
+              <w:rPr>
+                <w:rFonts w:ascii="Calibri" w:hAnsi="Calibri" w:eastAsia="Microsoft YaHei"/>
+                <w:sz w:val="20"/>
+              </w:rPr>
+              <w:t>系统主信息架构入口</w:t>
+            </w:r>
+          </w:p>
+        </w:tc>
+        <w:tc>
+          <w:tcPr>
+            <w:tcW w:type="dxa" w:w="1944"/>
+            <w:vAlign w:val="center"/>
+            <w:tcMar>
+              <w:top w:w="80" w:type="dxa"/>
+              <w:start w:w="120" w:type="dxa"/>
+              <w:bottom w:w="80" w:type="dxa"/>
+              <w:end w:w="120" w:type="dxa"/>
+            </w:tcMar>
+          </w:tcPr>
+          <w:p>
+            <w:r>
+              <w:rPr>
+                <w:rFonts w:ascii="Calibri" w:hAnsi="Calibri" w:eastAsia="Microsoft YaHei"/>
+                <w:sz w:val="20"/>
+              </w:rPr>
+              <w:t>Logo + 折叠按钮 + 一级菜单 + 系统设置二级菜单</w:t>
+            </w:r>
+          </w:p>
+        </w:tc>
+        <w:tc>
+          <w:tcPr>
+            <w:tcW w:type="dxa" w:w="2088"/>
+            <w:vAlign w:val="center"/>
+            <w:tcMar>
+              <w:top w:w="80" w:type="dxa"/>
+              <w:start w:w="120" w:type="dxa"/>
+              <w:bottom w:w="80" w:type="dxa"/>
+              <w:end w:w="120" w:type="dxa"/>
+            </w:tcMar>
+          </w:tcPr>
+          <w:p>
+            <w:r>
+              <w:rPr>
+                <w:rFonts w:ascii="Calibri" w:hAnsi="Calibri" w:eastAsia="Microsoft YaHei"/>
+                <w:sz w:val="20"/>
+              </w:rPr>
+              <w:t>支持折叠和展开；点击菜单切换hash路由</w:t>
+            </w:r>
+          </w:p>
+        </w:tc>
+        <w:tc>
+          <w:tcPr>
+            <w:tcW w:type="dxa" w:w="2088"/>
+            <w:vAlign w:val="center"/>
+            <w:tcMar>
+              <w:top w:w="80" w:type="dxa"/>
+              <w:start w:w="120" w:type="dxa"/>
+              <w:bottom w:w="80" w:type="dxa"/>
+              <w:end w:w="120" w:type="dxa"/>
+            </w:tcMar>
+          </w:tcPr>
+          <w:p>
+            <w:r>
+              <w:rPr>
+                <w:rFonts w:ascii="Calibri" w:hAnsi="Calibri" w:eastAsia="Microsoft YaHei"/>
+                <w:sz w:val="20"/>
+              </w:rPr>
+              <w:t>折叠后保留图标识别，减少横向空间占用</w:t>
+            </w:r>
+          </w:p>
+        </w:tc>
+      </w:tr>
+      <w:tr>
+        <w:tc>
+          <w:tcPr>
+            <w:tcW w:type="dxa" w:w="1440"/>
+            <w:vAlign w:val="center"/>
+            <w:tcMar>
+              <w:top w:w="80" w:type="dxa"/>
+              <w:start w:w="120" w:type="dxa"/>
+              <w:bottom w:w="80" w:type="dxa"/>
+              <w:end w:w="120" w:type="dxa"/>
+            </w:tcMar>
+          </w:tcPr>
+          <w:p>
+            <w:pPr>
+              <w:jc w:val="center"/>
+            </w:pPr>
+            <w:r>
+              <w:rPr>
+                <w:rFonts w:ascii="Calibri" w:hAnsi="Calibri" w:eastAsia="Microsoft YaHei"/>
+                <w:sz w:val="20"/>
+              </w:rPr>
+              <w:t>AI数据咨询助手</w:t>
+            </w:r>
+          </w:p>
+        </w:tc>
+        <w:tc>
+          <w:tcPr>
+            <w:tcW w:type="dxa" w:w="1800"/>
+            <w:vAlign w:val="center"/>
+            <w:tcMar>
+              <w:top w:w="80" w:type="dxa"/>
+              <w:start w:w="120" w:type="dxa"/>
+              <w:bottom w:w="80" w:type="dxa"/>
+              <w:end w:w="120" w:type="dxa"/>
+            </w:tcMar>
+          </w:tcPr>
+          <w:p>
+            <w:pPr>
+              <w:jc w:val="center"/>
+            </w:pPr>
+            <w:r>
+              <w:rPr>
+                <w:rFonts w:ascii="Calibri" w:hAnsi="Calibri" w:eastAsia="Microsoft YaHei"/>
+                <w:sz w:val="20"/>
+              </w:rPr>
+              <w:t>全局浮动辅助入口</w:t>
+            </w:r>
+          </w:p>
+        </w:tc>
+        <w:tc>
+          <w:tcPr>
+            <w:tcW w:type="dxa" w:w="1944"/>
+            <w:vAlign w:val="center"/>
+            <w:tcMar>
+              <w:top w:w="80" w:type="dxa"/>
+              <w:start w:w="120" w:type="dxa"/>
+              <w:bottom w:w="80" w:type="dxa"/>
+              <w:end w:w="120" w:type="dxa"/>
+            </w:tcMar>
+          </w:tcPr>
+          <w:p>
+            <w:pPr>
+              <w:jc w:val="center"/>
+            </w:pPr>
+            <w:r>
+              <w:rPr>
+                <w:rFonts w:ascii="Calibri" w:hAnsi="Calibri" w:eastAsia="Microsoft YaHei"/>
+                <w:sz w:val="20"/>
+              </w:rPr>
+              <w:t>默认右下角悬浮按钮</w:t>
+            </w:r>
+          </w:p>
+        </w:tc>
+        <w:tc>
+          <w:tcPr>
+            <w:tcW w:type="dxa" w:w="2088"/>
+            <w:vAlign w:val="center"/>
+            <w:tcMar>
+              <w:top w:w="80" w:type="dxa"/>
+              <w:start w:w="120" w:type="dxa"/>
+              <w:bottom w:w="80" w:type="dxa"/>
+              <w:end w:w="120" w:type="dxa"/>
+            </w:tcMar>
+          </w:tcPr>
+          <w:p>
+            <w:pPr>
+              <w:jc w:val="center"/>
+            </w:pPr>
+            <w:r>
+              <w:rPr>
+                <w:rFonts w:ascii="Calibri" w:hAnsi="Calibri" w:eastAsia="Microsoft YaHei"/>
+                <w:sz w:val="20"/>
+              </w:rPr>
+              <w:t>支持拖拽到任意位置</w:t>
+            </w:r>
+          </w:p>
+        </w:tc>
+        <w:tc>
+          <w:tcPr>
+            <w:tcW w:type="dxa" w:w="2088"/>
+            <w:vAlign w:val="center"/>
+            <w:tcMar>
+              <w:top w:w="80" w:type="dxa"/>
+              <w:start w:w="120" w:type="dxa"/>
+              <w:bottom w:w="80" w:type="dxa"/>
+              <w:end w:w="120" w:type="dxa"/>
+            </w:tcMar>
+          </w:tcPr>
+          <w:p>
+            <w:r>
+              <w:rPr>
+                <w:rFonts w:ascii="Calibri" w:hAnsi="Calibri" w:eastAsia="Microsoft YaHei"/>
+                <w:sz w:val="20"/>
+              </w:rPr>
+              <w:t>默认位置保持当前右下角，拖拽后不遮挡主要操作区</w:t>
+            </w:r>
+          </w:p>
+        </w:tc>
+      </w:tr>
+      <w:tr>
+        <w:tc>
+          <w:tcPr>
+            <w:tcW w:type="dxa" w:w="1440"/>
+            <w:vAlign w:val="center"/>
+            <w:tcMar>
+              <w:top w:w="80" w:type="dxa"/>
+              <w:start w:w="120" w:type="dxa"/>
+              <w:bottom w:w="80" w:type="dxa"/>
+              <w:end w:w="120" w:type="dxa"/>
+            </w:tcMar>
+          </w:tcPr>
+          <w:p>
+            <w:pPr>
+              <w:jc w:val="center"/>
+            </w:pPr>
+            <w:r>
+              <w:rPr>
+                <w:rFonts w:ascii="Calibri" w:hAnsi="Calibri" w:eastAsia="Microsoft YaHei"/>
+                <w:sz w:val="20"/>
+              </w:rPr>
+              <w:t>表头配置</w:t>
+            </w:r>
+          </w:p>
+        </w:tc>
+        <w:tc>
+          <w:tcPr>
+            <w:tcW w:type="dxa" w:w="1800"/>
+            <w:vAlign w:val="center"/>
+            <w:tcMar>
+              <w:top w:w="80" w:type="dxa"/>
+              <w:start w:w="120" w:type="dxa"/>
+              <w:bottom w:w="80" w:type="dxa"/>
+              <w:end w:w="120" w:type="dxa"/>
+            </w:tcMar>
+          </w:tcPr>
+          <w:p>
+            <w:pPr>
+              <w:jc w:val="center"/>
+            </w:pPr>
+            <w:r>
+              <w:rPr>
+                <w:rFonts w:ascii="Calibri" w:hAnsi="Calibri" w:eastAsia="Microsoft YaHei"/>
+                <w:sz w:val="20"/>
+              </w:rPr>
+              <w:t>台账明细字段显示控制</w:t>
+            </w:r>
+          </w:p>
+        </w:tc>
+        <w:tc>
+          <w:tcPr>
+            <w:tcW w:type="dxa" w:w="1944"/>
+            <w:vAlign w:val="center"/>
+            <w:tcMar>
+              <w:top w:w="80" w:type="dxa"/>
+              <w:start w:w="120" w:type="dxa"/>
+              <w:bottom w:w="80" w:type="dxa"/>
+              <w:end w:w="120" w:type="dxa"/>
+            </w:tcMar>
+          </w:tcPr>
+          <w:p>
+            <w:r>
+              <w:rPr>
+                <w:rFonts w:ascii="Calibri" w:hAnsi="Calibri" w:eastAsia="Microsoft YaHei"/>
+                <w:sz w:val="20"/>
+              </w:rPr>
+              <w:t>表格上方表头按钮 + 字段勾选面板</w:t>
+            </w:r>
+          </w:p>
+        </w:tc>
+        <w:tc>
+          <w:tcPr>
+            <w:tcW w:type="dxa" w:w="2088"/>
+            <w:vAlign w:val="center"/>
+            <w:tcMar>
+              <w:top w:w="80" w:type="dxa"/>
+              <w:start w:w="120" w:type="dxa"/>
+              <w:bottom w:w="80" w:type="dxa"/>
+              <w:end w:w="120" w:type="dxa"/>
+            </w:tcMar>
+          </w:tcPr>
+          <w:p>
+            <w:r>
+              <w:rPr>
+                <w:rFonts w:ascii="Calibri" w:hAnsi="Calibri" w:eastAsia="Microsoft YaHei"/>
+                <w:sz w:val="20"/>
+              </w:rPr>
+              <w:t>勾选或取消字段后，台账表头和数据列实时变化</w:t>
+            </w:r>
+          </w:p>
+        </w:tc>
+        <w:tc>
+          <w:tcPr>
+            <w:tcW w:type="dxa" w:w="2088"/>
+            <w:vAlign w:val="center"/>
+            <w:tcMar>
+              <w:top w:w="80" w:type="dxa"/>
+              <w:start w:w="120" w:type="dxa"/>
+              <w:bottom w:w="80" w:type="dxa"/>
+              <w:end w:w="120" w:type="dxa"/>
+            </w:tcMar>
+          </w:tcPr>
+          <w:p>
+            <w:r>
+              <w:rPr>
+                <w:rFonts w:ascii="Calibri" w:hAnsi="Calibri" w:eastAsia="Microsoft YaHei"/>
+                <w:sz w:val="20"/>
+              </w:rPr>
+              <w:t>区域、营业所添加后固定插入到经销商字段前</w:t>
+            </w:r>
+          </w:p>
+        </w:tc>
+      </w:tr>
+      <w:tr>
+        <w:tc>
+          <w:tcPr>
+            <w:tcW w:type="dxa" w:w="1440"/>
+            <w:vAlign w:val="center"/>
+            <w:tcMar>
+              <w:top w:w="80" w:type="dxa"/>
+              <w:start w:w="120" w:type="dxa"/>
+              <w:bottom w:w="80" w:type="dxa"/>
+              <w:end w:w="120" w:type="dxa"/>
+            </w:tcMar>
+          </w:tcPr>
+          <w:p>
+            <w:pPr>
+              <w:jc w:val="center"/>
+            </w:pPr>
+            <w:r>
+              <w:rPr>
+                <w:rFonts w:ascii="Calibri" w:hAnsi="Calibri" w:eastAsia="Microsoft YaHei"/>
+                <w:sz w:val="20"/>
+              </w:rPr>
+              <w:t>分组展示</w:t>
+            </w:r>
+          </w:p>
+        </w:tc>
+        <w:tc>
+          <w:tcPr>
+            <w:tcW w:type="dxa" w:w="1800"/>
+            <w:vAlign w:val="center"/>
+            <w:tcMar>
+              <w:top w:w="80" w:type="dxa"/>
+              <w:start w:w="120" w:type="dxa"/>
+              <w:bottom w:w="80" w:type="dxa"/>
+              <w:end w:w="120" w:type="dxa"/>
+            </w:tcMar>
+          </w:tcPr>
+          <w:p>
+            <w:r>
+              <w:rPr>
+                <w:rFonts w:ascii="Calibri" w:hAnsi="Calibri" w:eastAsia="Microsoft YaHei"/>
+                <w:sz w:val="20"/>
+              </w:rPr>
+              <w:t>台账数据按组织维度聚合查看</w:t>
+            </w:r>
+          </w:p>
+        </w:tc>
+        <w:tc>
+          <w:tcPr>
+            <w:tcW w:type="dxa" w:w="1944"/>
+            <w:vAlign w:val="center"/>
+            <w:tcMar>
+              <w:top w:w="80" w:type="dxa"/>
+              <w:start w:w="120" w:type="dxa"/>
+              <w:bottom w:w="80" w:type="dxa"/>
+              <w:end w:w="120" w:type="dxa"/>
+            </w:tcMar>
+          </w:tcPr>
+          <w:p>
+            <w:pPr>
+              <w:jc w:val="center"/>
+            </w:pPr>
+            <w:r>
+              <w:rPr>
+                <w:rFonts w:ascii="Calibri" w:hAnsi="Calibri" w:eastAsia="Microsoft YaHei"/>
+                <w:sz w:val="20"/>
+              </w:rPr>
+              <w:t>表格右上角分组按钮</w:t>
+            </w:r>
+          </w:p>
+        </w:tc>
+        <w:tc>
+          <w:tcPr>
+            <w:tcW w:type="dxa" w:w="2088"/>
+            <w:vAlign w:val="center"/>
+            <w:tcMar>
+              <w:top w:w="80" w:type="dxa"/>
+              <w:start w:w="120" w:type="dxa"/>
+              <w:bottom w:w="80" w:type="dxa"/>
+              <w:end w:w="120" w:type="dxa"/>
+            </w:tcMar>
+          </w:tcPr>
+          <w:p>
+            <w:r>
+              <w:rPr>
+                <w:rFonts w:ascii="Calibri" w:hAnsi="Calibri" w:eastAsia="Microsoft YaHei"/>
+                <w:sz w:val="20"/>
+              </w:rPr>
+              <w:t>选择区域、营业所、经销商进行单选分组；支持展开和折叠</w:t>
+            </w:r>
+          </w:p>
+        </w:tc>
+        <w:tc>
+          <w:tcPr>
+            <w:tcW w:type="dxa" w:w="2088"/>
+            <w:vAlign w:val="center"/>
+            <w:tcMar>
+              <w:top w:w="80" w:type="dxa"/>
+              <w:start w:w="120" w:type="dxa"/>
+              <w:bottom w:w="80" w:type="dxa"/>
+              <w:end w:w="120" w:type="dxa"/>
+            </w:tcMar>
+          </w:tcPr>
+          <w:p>
+            <w:r>
+              <w:rPr>
+                <w:rFonts w:ascii="Calibri" w:hAnsi="Calibri" w:eastAsia="Microsoft YaHei"/>
+                <w:sz w:val="20"/>
+              </w:rPr>
+              <w:t>分组后仍展示明细数据，便于按组织查看汇总结果</w:t>
+            </w:r>
+          </w:p>
+        </w:tc>
+      </w:tr>
+      <w:tr>
+        <w:tc>
+          <w:tcPr>
+            <w:tcW w:type="dxa" w:w="1440"/>
+            <w:vAlign w:val="center"/>
+            <w:tcMar>
+              <w:top w:w="80" w:type="dxa"/>
+              <w:start w:w="120" w:type="dxa"/>
+              <w:bottom w:w="80" w:type="dxa"/>
+              <w:end w:w="120" w:type="dxa"/>
+            </w:tcMar>
+          </w:tcPr>
+          <w:p>
+            <w:pPr>
+              <w:jc w:val="center"/>
+            </w:pPr>
+            <w:r>
+              <w:rPr>
+                <w:rFonts w:ascii="Calibri" w:hAnsi="Calibri" w:eastAsia="Microsoft YaHei"/>
+                <w:sz w:val="20"/>
+              </w:rPr>
+              <w:t>导出功能</w:t>
+            </w:r>
+          </w:p>
+        </w:tc>
+        <w:tc>
+          <w:tcPr>
+            <w:tcW w:type="dxa" w:w="1800"/>
+            <w:vAlign w:val="center"/>
+            <w:tcMar>
+              <w:top w:w="80" w:type="dxa"/>
+              <w:start w:w="120" w:type="dxa"/>
+              <w:bottom w:w="80" w:type="dxa"/>
+              <w:end w:w="120" w:type="dxa"/>
+            </w:tcMar>
+          </w:tcPr>
+          <w:p>
+            <w:pPr>
+              <w:jc w:val="center"/>
+            </w:pPr>
+            <w:r>
+              <w:rPr>
+                <w:rFonts w:ascii="Calibri" w:hAnsi="Calibri" w:eastAsia="Microsoft YaHei"/>
+                <w:sz w:val="20"/>
+              </w:rPr>
+              <w:t>当前明细数据导出</w:t>
+            </w:r>
+          </w:p>
+        </w:tc>
+        <w:tc>
+          <w:tcPr>
+            <w:tcW w:type="dxa" w:w="1944"/>
+            <w:vAlign w:val="center"/>
+            <w:tcMar>
+              <w:top w:w="80" w:type="dxa"/>
+              <w:start w:w="120" w:type="dxa"/>
+              <w:bottom w:w="80" w:type="dxa"/>
+              <w:end w:w="120" w:type="dxa"/>
+            </w:tcMar>
+          </w:tcPr>
+          <w:p>
+            <w:r>
+              <w:rPr>
+                <w:rFonts w:ascii="Calibri" w:hAnsi="Calibri" w:eastAsia="Microsoft YaHei"/>
+                <w:sz w:val="20"/>
+              </w:rPr>
+              <w:t>导出按钮位于分组按钮右侧</w:t>
+            </w:r>
+          </w:p>
+        </w:tc>
+        <w:tc>
+          <w:tcPr>
+            <w:tcW w:type="dxa" w:w="2088"/>
+            <w:vAlign w:val="center"/>
+            <w:tcMar>
+              <w:top w:w="80" w:type="dxa"/>
+              <w:start w:w="120" w:type="dxa"/>
+              <w:bottom w:w="80" w:type="dxa"/>
+              <w:end w:w="120" w:type="dxa"/>
+            </w:tcMar>
+          </w:tcPr>
+          <w:p>
+            <w:r>
+              <w:rPr>
+                <w:rFonts w:ascii="Calibri" w:hAnsi="Calibri" w:eastAsia="Microsoft YaHei"/>
+                <w:sz w:val="20"/>
+              </w:rPr>
+              <w:t>点击导出当前筛选、当前表头下的数据</w:t>
+            </w:r>
+          </w:p>
+        </w:tc>
+        <w:tc>
+          <w:tcPr>
+            <w:tcW w:type="dxa" w:w="2088"/>
+            <w:vAlign w:val="center"/>
+            <w:tcMar>
+              <w:top w:w="80" w:type="dxa"/>
+              <w:start w:w="120" w:type="dxa"/>
+              <w:bottom w:w="80" w:type="dxa"/>
+              <w:end w:w="120" w:type="dxa"/>
+            </w:tcMar>
+          </w:tcPr>
+          <w:p>
+            <w:r>
+              <w:rPr>
+                <w:rFonts w:ascii="Calibri" w:hAnsi="Calibri" w:eastAsia="Microsoft YaHei"/>
+                <w:sz w:val="20"/>
+              </w:rPr>
+              <w:t>导出结果应与页面当前可见数据保持一致</w:t>
+            </w:r>
+          </w:p>
+        </w:tc>
+      </w:tr>
+    </w:tbl>
+    <w:p/>
     <w:p>
       <w:pPr>
         <w:pStyle w:val="Heading2"/>

</xml_diff>